<commit_message>
Add happicare_admin_version2 to comparison deck, report and doc
Co-Authored-By: Claude Sonnet 5.5 <noreply@anthropic.com>
Claude-Session: https://claude.ai/code/session_018MxhhtNcXMywPHAmzeQnb1
</commit_message>
<xml_diff>
--- a/happicare-presentation/HappiCare_방식비교_보고서.docx
+++ b/happicare-presentation/HappiCare_방식비교_보고서.docx
@@ -7,10 +7,10 @@
         <w:pStyle w:val="Title"/>
       </w:pPr>
       <w:r>
-        <w:t xml:space="preserve">HappiCare ��� ������ ��������������� ������ ������</w:t>
-      </w:r>
-    </w:p>
-    <w:bookmarkStart w:id="36" w:name="happicare-두-가지-바이브코딩-방식-비교"/>
+        <w:t xml:space="preserve">HappiCare ��������� ������</w:t>
+      </w:r>
+    </w:p>
+    <w:bookmarkStart w:id="44" w:name="happicare-두-가지-바이브코딩-방식-비교"/>
     <w:p>
       <w:pPr>
         <w:pStyle w:val="Heading1"/>
@@ -37,13 +37,49 @@
         <w:t xml:space="preserve">서로 다른 방식</w:t>
       </w:r>
       <w:r>
-        <w:t xml:space="preserve">으로 AI와 함께 만든 두 저장소를 비교합니다.</w:t>
-      </w:r>
-      <w:r>
-        <w:t xml:space="preserve"> </w:t>
-      </w:r>
-      <w:r>
-        <w:t xml:space="preserve">기준 시점은 2026-10-25이며, 각 저장소의 기본 브랜치를 읽고 정리했습니다. 앱을 직접 실행하거나 빌드해 보지는 않았습니다.</w:t>
+        <w:t xml:space="preserve">으로 AI와 함께 만든 저장소들을 비교합니다. 본문의 1~7장은</w:t>
+      </w:r>
+      <w:r>
+        <w:t xml:space="preserve"> </w:t>
+      </w:r>
+      <w:r>
+        <w:rPr>
+          <w:rStyle w:val="VerbatimChar"/>
+        </w:rPr>
+        <w:t xml:space="preserve">happicare</w:t>
+      </w:r>
+      <w:r>
+        <w:t xml:space="preserve">와</w:t>
+      </w:r>
+      <w:r>
+        <w:t xml:space="preserve"> </w:t>
+      </w:r>
+      <w:r>
+        <w:rPr>
+          <w:rStyle w:val="VerbatimChar"/>
+        </w:rPr>
+        <w:t xml:space="preserve">happicare_front2</w:t>
+      </w:r>
+      <w:r>
+        <w:t xml:space="preserve">를 비교하고, 8장에서 관리자 프로토타입</w:t>
+      </w:r>
+      <w:r>
+        <w:t xml:space="preserve"> </w:t>
+      </w:r>
+      <w:r>
+        <w:rPr>
+          <w:rStyle w:val="VerbatimChar"/>
+        </w:rPr>
+        <w:t xml:space="preserve">happicare_admin_version2</w:t>
+      </w:r>
+      <w:r>
+        <w:t xml:space="preserve">를 더해 세 단계로 정리합니다.</w:t>
+      </w:r>
+      <w:r>
+        <w:t xml:space="preserve"> </w:t>
+      </w:r>
+      <w:r>
+        <w:t xml:space="preserve">기준 시점은 2026-10-26이며, 각 저장소의 기본 브랜치를 읽고 정리했습니다. 앱을 직접 실행하거나 빌드해 보지는 않았습니다.</w:t>
       </w:r>
     </w:p>
     <w:bookmarkStart w:id="20" w:name="Xf93db511b56089828fb7793b2bb2de4fc89c210"/>
@@ -3508,13 +3544,517 @@
       </w:r>
     </w:p>
     <w:bookmarkEnd w:id="34"/>
-    <w:bookmarkStart w:id="35" w:name="Xfa58b08ea181ad29a219940b296f37e457b837a"/>
+    <w:bookmarkStart w:id="42" w:name="X70b0112eea97248d06bfacb1913c832500ed31f"/>
     <w:p>
       <w:pPr>
         <w:pStyle w:val="Heading2"/>
       </w:pPr>
       <w:r>
-        <w:t xml:space="preserve">8. 참고 위치</w:t>
+        <w:t xml:space="preserve">8. 관리자 프로토타입</w:t>
+      </w:r>
+      <w:r>
+        <w:t xml:space="preserve"> </w:t>
+      </w:r>
+      <w:r>
+        <w:rPr>
+          <w:rStyle w:val="VerbatimChar"/>
+        </w:rPr>
+        <w:t xml:space="preserve">happicare_admin_version2</w:t>
+      </w:r>
+      <w:r>
+        <w:t xml:space="preserve"> </w:t>
+      </w:r>
+      <w:r>
+        <w:t xml:space="preserve">추가</w:t>
+      </w:r>
+    </w:p>
+    <w:bookmarkStart w:id="35" w:name="Xa20927d0edc1958b0c7e4b9d247754c2efe8043"/>
+    <w:p>
+      <w:pPr>
+        <w:pStyle w:val="Heading3"/>
+      </w:pPr>
+      <w:r>
+        <w:t xml:space="preserve">8.1 저장소 4개의 관계</w:t>
+      </w:r>
+    </w:p>
+    <w:tbl>
+      <w:tblPr>
+        <w:tblStyle w:val="Table"/>
+        <w:tblW w:type="auto" w:w="0"/>
+        <w:tblLook w:firstRow="1" w:lastRow="0" w:firstColumn="0" w:lastColumn="0" w:noHBand="0" w:noVBand="0" w:val="0020"/>
+        <w:jc w:val="start"/>
+      </w:tblPr>
+      <w:tblGrid>
+        <w:gridCol w:w="2640"/>
+        <w:gridCol w:w="2640"/>
+        <w:gridCol w:w="2640"/>
+      </w:tblGrid>
+      <w:tr>
+        <w:trPr>
+          <w:tblHeader w:val="true"/>
+        </w:trPr>
+        <w:tc>
+          <w:tcPr/>
+          <w:p>
+            <w:pPr>
+              <w:pStyle w:val="Compact"/>
+              <w:jc w:val="left"/>
+            </w:pPr>
+            <w:r>
+              <w:t xml:space="preserve">저장소</w:t>
+            </w:r>
+          </w:p>
+        </w:tc>
+        <w:tc>
+          <w:tcPr/>
+          <w:p>
+            <w:pPr>
+              <w:pStyle w:val="Compact"/>
+              <w:jc w:val="left"/>
+            </w:pPr>
+            <w:r>
+              <w:t xml:space="preserve">상태</w:t>
+            </w:r>
+          </w:p>
+        </w:tc>
+        <w:tc>
+          <w:tcPr/>
+          <w:p>
+            <w:pPr>
+              <w:pStyle w:val="Compact"/>
+              <w:jc w:val="left"/>
+            </w:pPr>
+            <w:r>
+              <w:t xml:space="preserve">역할</w:t>
+            </w:r>
+          </w:p>
+        </w:tc>
+      </w:tr>
+      <w:tr>
+        <w:tc>
+          <w:tcPr/>
+          <w:p>
+            <w:pPr>
+              <w:pStyle w:val="Compact"/>
+              <w:jc w:val="left"/>
+            </w:pPr>
+            <w:r>
+              <w:rPr>
+                <w:rStyle w:val="VerbatimChar"/>
+              </w:rPr>
+              <w:t xml:space="preserve">happicare_admin</w:t>
+            </w:r>
+          </w:p>
+        </w:tc>
+        <w:tc>
+          <w:tcPr/>
+          <w:p>
+            <w:pPr>
+              <w:pStyle w:val="Compact"/>
+              <w:jc w:val="left"/>
+            </w:pPr>
+            <w:r>
+              <w:t xml:space="preserve">거의 비어 있음(README 한 줄, 커밋 1개, 2026-09-04)</w:t>
+            </w:r>
+          </w:p>
+        </w:tc>
+        <w:tc>
+          <w:tcPr/>
+          <w:p>
+            <w:pPr>
+              <w:pStyle w:val="Compact"/>
+              <w:jc w:val="left"/>
+            </w:pPr>
+            <w:r>
+              <w:rPr>
+                <w:rStyle w:val="VerbatimChar"/>
+              </w:rPr>
+              <w:t xml:space="preserve">happicare_admin_version2</w:t>
+            </w:r>
+            <w:r>
+              <w:t xml:space="preserve">를 만들기 전의 빈 시작 저장소로 보임</w:t>
+            </w:r>
+          </w:p>
+        </w:tc>
+      </w:tr>
+      <w:tr>
+        <w:tc>
+          <w:tcPr/>
+          <w:p>
+            <w:pPr>
+              <w:pStyle w:val="Compact"/>
+              <w:jc w:val="left"/>
+            </w:pPr>
+            <w:r>
+              <w:rPr>
+                <w:rStyle w:val="VerbatimChar"/>
+              </w:rPr>
+              <w:t xml:space="preserve">happicare</w:t>
+            </w:r>
+          </w:p>
+        </w:tc>
+        <w:tc>
+          <w:tcPr/>
+          <w:p>
+            <w:pPr>
+              <w:pStyle w:val="Compact"/>
+              <w:jc w:val="left"/>
+            </w:pPr>
+            <w:r>
+              <w:t xml:space="preserve">React 전환 프로토타입</w:t>
+            </w:r>
+          </w:p>
+        </w:tc>
+        <w:tc>
+          <w:tcPr/>
+          <w:p>
+            <w:pPr>
+              <w:pStyle w:val="Compact"/>
+              <w:jc w:val="left"/>
+            </w:pPr>
+            <w:r>
+              <w:t xml:space="preserve">고객 화면</w:t>
+            </w:r>
+          </w:p>
+        </w:tc>
+      </w:tr>
+      <w:tr>
+        <w:tc>
+          <w:tcPr/>
+          <w:p>
+            <w:pPr>
+              <w:pStyle w:val="Compact"/>
+              <w:jc w:val="left"/>
+            </w:pPr>
+            <w:r>
+              <w:rPr>
+                <w:rStyle w:val="VerbatimChar"/>
+              </w:rPr>
+              <w:t xml:space="preserve">happicare_admin_version2</w:t>
+            </w:r>
+          </w:p>
+        </w:tc>
+        <w:tc>
+          <w:tcPr/>
+          <w:p>
+            <w:pPr>
+              <w:pStyle w:val="Compact"/>
+              <w:jc w:val="left"/>
+            </w:pPr>
+            <w:r>
+              <w:t xml:space="preserve">관리자 화면 프론트</w:t>
+            </w:r>
+          </w:p>
+        </w:tc>
+        <w:tc>
+          <w:tcPr/>
+          <w:p>
+            <w:pPr>
+              <w:pStyle w:val="Compact"/>
+              <w:jc w:val="left"/>
+            </w:pPr>
+            <w:r>
+              <w:t xml:space="preserve">MSW mock, 실제 API로 전환 준비 완료</w:t>
+            </w:r>
+          </w:p>
+        </w:tc>
+      </w:tr>
+      <w:tr>
+        <w:tc>
+          <w:tcPr/>
+          <w:p>
+            <w:pPr>
+              <w:pStyle w:val="Compact"/>
+              <w:jc w:val="left"/>
+            </w:pPr>
+            <w:r>
+              <w:rPr>
+                <w:rStyle w:val="VerbatimChar"/>
+              </w:rPr>
+              <w:t xml:space="preserve">happicare_front2</w:t>
+            </w:r>
+          </w:p>
+        </w:tc>
+        <w:tc>
+          <w:tcPr/>
+          <w:p>
+            <w:pPr>
+              <w:pStyle w:val="Compact"/>
+              <w:jc w:val="left"/>
+            </w:pPr>
+            <w:r>
+              <w:t xml:space="preserve">풀스택</w:t>
+            </w:r>
+          </w:p>
+        </w:tc>
+        <w:tc>
+          <w:tcPr/>
+          <w:p>
+            <w:pPr>
+              <w:pStyle w:val="Compact"/>
+              <w:jc w:val="left"/>
+            </w:pPr>
+            <w:r>
+              <w:t xml:space="preserve">병원 화면 + 관리자 화면 + NestJS + DB + 배포</w:t>
+            </w:r>
+          </w:p>
+        </w:tc>
+      </w:tr>
+    </w:tbl>
+    <w:p>
+      <w:pPr>
+        <w:pStyle w:val="BodyText"/>
+      </w:pPr>
+      <w:r>
+        <w:rPr>
+          <w:rStyle w:val="VerbatimChar"/>
+        </w:rPr>
+        <w:t xml:space="preserve">happicare_admin_version2</w:t>
+      </w:r>
+      <w:r>
+        <w:t xml:space="preserve">와</w:t>
+      </w:r>
+      <w:r>
+        <w:t xml:space="preserve"> </w:t>
+      </w:r>
+      <w:r>
+        <w:rPr>
+          <w:rStyle w:val="VerbatimChar"/>
+        </w:rPr>
+        <w:t xml:space="preserve">happicare_front2</w:t>
+      </w:r>
+      <w:r>
+        <w:t xml:space="preserve">는 같은 관리자 화면 명세(공지 Tiptap 에디터, 담당자 관리, 자주 쓰는 답변 등)를 다룹니다. 시기도 앞서므로(2026-09-06~09-20 대 2026-09-30~10-11) 프로토타입에서 풀스택으로 발전한 것으로 보입니다. 다만 두 저장소 사이에 코드를 가져온 흔적은 확인하지 못했으므로, 실제 관계는 작성자에게 확인이 필요합니다.</w:t>
+      </w:r>
+    </w:p>
+    <w:bookmarkEnd w:id="35"/>
+    <w:bookmarkStart w:id="36" w:name="X5ecc5a891ed6932e44c4abfaabacf737e97ebc7"/>
+    <w:p>
+      <w:pPr>
+        <w:pStyle w:val="Heading3"/>
+      </w:pPr>
+      <w:r>
+        <w:t xml:space="preserve">8.2</w:t>
+      </w:r>
+      <w:r>
+        <w:t xml:space="preserve"> </w:t>
+      </w:r>
+      <w:r>
+        <w:rPr>
+          <w:rStyle w:val="VerbatimChar"/>
+        </w:rPr>
+        <w:t xml:space="preserve">happicare_admin_version2</w:t>
+      </w:r>
+      <w:r>
+        <w:t xml:space="preserve">는 무엇인가</w:t>
+      </w:r>
+    </w:p>
+    <w:p>
+      <w:pPr>
+        <w:numPr>
+          <w:ilvl w:val="0"/>
+          <w:numId w:val="1014"/>
+        </w:numPr>
+        <w:pStyle w:val="Compact"/>
+      </w:pPr>
+      <w:r>
+        <w:t xml:space="preserve">해피케어 CRM</w:t>
+      </w:r>
+      <w:r>
+        <w:t xml:space="preserve"> </w:t>
+      </w:r>
+      <w:r>
+        <w:rPr>
+          <w:bCs/>
+          <w:b/>
+        </w:rPr>
+        <w:t xml:space="preserve">관리자용 문의 관리 프론트엔드</w:t>
+      </w:r>
+      <w:r>
+        <w:t xml:space="preserve">입니다. React 19 + Vite 8, JavaScript/JSX이고 백엔드는 없습니다.</w:t>
+      </w:r>
+    </w:p>
+    <w:p>
+      <w:pPr>
+        <w:numPr>
+          <w:ilvl w:val="0"/>
+          <w:numId w:val="1014"/>
+        </w:numPr>
+        <w:pStyle w:val="Compact"/>
+      </w:pPr>
+      <w:r>
+        <w:t xml:space="preserve">규모는 파일 약 230개, JS/JSX 약 4천 줄, 커밋 8개(2026-09-06~09-20)입니다.</w:t>
+      </w:r>
+    </w:p>
+    <w:p>
+      <w:pPr>
+        <w:numPr>
+          <w:ilvl w:val="0"/>
+          <w:numId w:val="1014"/>
+        </w:numPr>
+        <w:pStyle w:val="Compact"/>
+      </w:pPr>
+      <w:r>
+        <w:t xml:space="preserve">구현된 화면은 다음과 같습니다.</w:t>
+      </w:r>
+    </w:p>
+    <w:p>
+      <w:pPr>
+        <w:numPr>
+          <w:ilvl w:val="1"/>
+          <w:numId w:val="1015"/>
+        </w:numPr>
+        <w:pStyle w:val="Compact"/>
+      </w:pPr>
+      <w:r>
+        <w:t xml:space="preserve">문의 목록(필터, 정렬, 페이지네이션, 검색 조건 URL 보존)</w:t>
+      </w:r>
+    </w:p>
+    <w:p>
+      <w:pPr>
+        <w:numPr>
+          <w:ilvl w:val="1"/>
+          <w:numId w:val="1015"/>
+        </w:numPr>
+        <w:pStyle w:val="Compact"/>
+      </w:pPr>
+      <w:r>
+        <w:t xml:space="preserve">유형별 문의 상세 5종(일반, 알림톡, 신규 프로모션, 신규 예약, 발송그룹)</w:t>
+      </w:r>
+    </w:p>
+    <w:p>
+      <w:pPr>
+        <w:numPr>
+          <w:ilvl w:val="1"/>
+          <w:numId w:val="1015"/>
+        </w:numPr>
+        <w:pStyle w:val="Compact"/>
+      </w:pPr>
+      <w:r>
+        <w:t xml:space="preserve">담당자 지정과</w:t>
+      </w:r>
+      <w:r>
+        <w:t xml:space="preserve"> </w:t>
+      </w:r>
+      <w:r>
+        <w:rPr>
+          <w:rStyle w:val="VerbatimChar"/>
+        </w:rPr>
+        <w:t xml:space="preserve">확인전 → 확인중 → 답변완료</w:t>
+      </w:r>
+      <w:r>
+        <w:t xml:space="preserve"> </w:t>
+      </w:r>
+      <w:r>
+        <w:t xml:space="preserve">상태 전이</w:t>
+      </w:r>
+    </w:p>
+    <w:p>
+      <w:pPr>
+        <w:numPr>
+          <w:ilvl w:val="1"/>
+          <w:numId w:val="1015"/>
+        </w:numPr>
+        <w:pStyle w:val="Compact"/>
+      </w:pPr>
+      <w:r>
+        <w:t xml:space="preserve">내부 메모, 자주 쓰는 답변(드래그 정렬), XLSX 다운로드</w:t>
+      </w:r>
+    </w:p>
+    <w:p>
+      <w:pPr>
+        <w:numPr>
+          <w:ilvl w:val="1"/>
+          <w:numId w:val="1015"/>
+        </w:numPr>
+        <w:pStyle w:val="Compact"/>
+      </w:pPr>
+      <w:r>
+        <w:t xml:space="preserve">공지사항 등록·수정·삭제, 담당자 관리</w:t>
+      </w:r>
+    </w:p>
+    <w:p>
+      <w:pPr>
+        <w:numPr>
+          <w:ilvl w:val="0"/>
+          <w:numId w:val="1014"/>
+        </w:numPr>
+        <w:pStyle w:val="Compact"/>
+      </w:pPr>
+      <w:r>
+        <w:t xml:space="preserve">기술 스택은 TanStack Query, React Hook Form + Zod, React Router 7, Tiptap, dnd-kit, Vitest, Playwright입니다.</w:t>
+      </w:r>
+    </w:p>
+    <w:bookmarkEnd w:id="36"/>
+    <w:bookmarkStart w:id="37" w:name="X37309f8c4531b725f839874cfc84ac821b0517a"/>
+    <w:p>
+      <w:pPr>
+        <w:pStyle w:val="Heading3"/>
+      </w:pPr>
+      <w:r>
+        <w:t xml:space="preserve">8.3 핵심 아이디어: MSW로 서버 없이 실제 HTTP처럼</w:t>
+      </w:r>
+    </w:p>
+    <w:p>
+      <w:pPr>
+        <w:pStyle w:val="FirstParagraph"/>
+      </w:pPr>
+      <w:r>
+        <w:t xml:space="preserve">백엔드가 없어도 화면 코드는 mock 함수가 아니라</w:t>
+      </w:r>
+      <w:r>
+        <w:t xml:space="preserve"> </w:t>
+      </w:r>
+      <w:r>
+        <w:rPr>
+          <w:bCs/>
+          <w:b/>
+        </w:rPr>
+        <w:t xml:space="preserve">실제</w:t>
+      </w:r>
+      <w:r>
+        <w:rPr>
+          <w:bCs/>
+          <w:b/>
+        </w:rPr>
+        <w:t xml:space="preserve"> </w:t>
+      </w:r>
+      <w:r>
+        <w:rPr>
+          <w:rStyle w:val="VerbatimChar"/>
+          <w:bCs/>
+          <w:b/>
+        </w:rPr>
+        <w:t xml:space="preserve">/api/*</w:t>
+      </w:r>
+      <w:r>
+        <w:rPr>
+          <w:bCs/>
+          <w:b/>
+        </w:rPr>
+        <w:t xml:space="preserve"> </w:t>
+      </w:r>
+      <w:r>
+        <w:rPr>
+          <w:bCs/>
+          <w:b/>
+        </w:rPr>
+        <w:t xml:space="preserve">HTTP 요청</w:t>
+      </w:r>
+      <w:r>
+        <w:t xml:space="preserve">을 보냅니다. MSW(Mock Service Worker)가 요청을 가로채</w:t>
+      </w:r>
+      <w:r>
+        <w:t xml:space="preserve"> </w:t>
+      </w:r>
+      <w:r>
+        <w:rPr>
+          <w:rStyle w:val="VerbatimChar"/>
+        </w:rPr>
+        <w:t xml:space="preserve">localStorage</w:t>
+      </w:r>
+      <w:r>
+        <w:t xml:space="preserve">에 저장합니다.</w:t>
       </w:r>
     </w:p>
     <w:tbl>
@@ -3540,6 +4080,1149 @@
               <w:jc w:val="left"/>
             </w:pPr>
             <w:r>
+              <w:t xml:space="preserve">설정</w:t>
+            </w:r>
+          </w:p>
+        </w:tc>
+        <w:tc>
+          <w:tcPr/>
+          <w:p>
+            <w:pPr>
+              <w:pStyle w:val="Compact"/>
+              <w:jc w:val="left"/>
+            </w:pPr>
+            <w:r>
+              <w:t xml:space="preserve">동작</w:t>
+            </w:r>
+          </w:p>
+        </w:tc>
+      </w:tr>
+      <w:tr>
+        <w:tc>
+          <w:tcPr/>
+          <w:p>
+            <w:pPr>
+              <w:pStyle w:val="Compact"/>
+              <w:jc w:val="left"/>
+            </w:pPr>
+            <w:r>
+              <w:t xml:space="preserve">기본값(</w:t>
+            </w:r>
+            <w:r>
+              <w:rPr>
+                <w:rStyle w:val="VerbatimChar"/>
+              </w:rPr>
+              <w:t xml:space="preserve">VITE_USE_MOCKS=true</w:t>
+            </w:r>
+            <w:r>
+              <w:t xml:space="preserve">)</w:t>
+            </w:r>
+          </w:p>
+        </w:tc>
+        <w:tc>
+          <w:tcPr/>
+          <w:p>
+            <w:pPr>
+              <w:pStyle w:val="Compact"/>
+              <w:jc w:val="left"/>
+            </w:pPr>
+            <w:r>
+              <w:t xml:space="preserve">MSW가 요청을 가로채 가짜 서버처럼 응답</w:t>
+            </w:r>
+          </w:p>
+        </w:tc>
+      </w:tr>
+      <w:tr>
+        <w:tc>
+          <w:tcPr/>
+          <w:p>
+            <w:pPr>
+              <w:pStyle w:val="Compact"/>
+              <w:jc w:val="left"/>
+            </w:pPr>
+            <w:r>
+              <w:rPr>
+                <w:rStyle w:val="VerbatimChar"/>
+              </w:rPr>
+              <w:t xml:space="preserve">VITE_USE_MOCKS=false</w:t>
+            </w:r>
+            <w:r>
+              <w:t xml:space="preserve"> </w:t>
+            </w:r>
+            <w:r>
+              <w:t xml:space="preserve">+</w:t>
+            </w:r>
+            <w:r>
+              <w:t xml:space="preserve"> </w:t>
+            </w:r>
+            <w:r>
+              <w:rPr>
+                <w:rStyle w:val="VerbatimChar"/>
+              </w:rPr>
+              <w:t xml:space="preserve">VITE_API_BASE_URL</w:t>
+            </w:r>
+          </w:p>
+        </w:tc>
+        <w:tc>
+          <w:tcPr/>
+          <w:p>
+            <w:pPr>
+              <w:pStyle w:val="Compact"/>
+              <w:jc w:val="left"/>
+            </w:pPr>
+            <w:r>
+              <w:t xml:space="preserve">화면 수정 없이 실제 백엔드로 전환</w:t>
+            </w:r>
+          </w:p>
+        </w:tc>
+      </w:tr>
+      <w:tr>
+        <w:tc>
+          <w:tcPr/>
+          <w:p>
+            <w:pPr>
+              <w:pStyle w:val="Compact"/>
+              <w:jc w:val="left"/>
+            </w:pPr>
+            <w:r>
+              <w:rPr>
+                <w:rStyle w:val="VerbatimChar"/>
+              </w:rPr>
+              <w:t xml:space="preserve">?mockDelay=1500</w:t>
+            </w:r>
+          </w:p>
+        </w:tc>
+        <w:tc>
+          <w:tcPr/>
+          <w:p>
+            <w:pPr>
+              <w:pStyle w:val="Compact"/>
+              <w:jc w:val="left"/>
+            </w:pPr>
+            <w:r>
+              <w:t xml:space="preserve">응답을 1.5초 지연(로딩 화면 확인)</w:t>
+            </w:r>
+          </w:p>
+        </w:tc>
+      </w:tr>
+      <w:tr>
+        <w:tc>
+          <w:tcPr/>
+          <w:p>
+            <w:pPr>
+              <w:pStyle w:val="Compact"/>
+              <w:jc w:val="left"/>
+            </w:pPr>
+            <w:r>
+              <w:rPr>
+                <w:rStyle w:val="VerbatimChar"/>
+              </w:rPr>
+              <w:t xml:space="preserve">?mockStatus=500</w:t>
+            </w:r>
+          </w:p>
+        </w:tc>
+        <w:tc>
+          <w:tcPr/>
+          <w:p>
+            <w:pPr>
+              <w:pStyle w:val="Compact"/>
+              <w:jc w:val="left"/>
+            </w:pPr>
+            <w:r>
+              <w:t xml:space="preserve">모든 요청을 지정 상태(400, 403, 404, 409, 422, 500)로 실패시켜 오류 화면 확인</w:t>
+            </w:r>
+          </w:p>
+        </w:tc>
+      </w:tr>
+    </w:tbl>
+    <w:p>
+      <w:pPr>
+        <w:pStyle w:val="BodyText"/>
+      </w:pPr>
+      <w:r>
+        <w:t xml:space="preserve">강제 오류는 저장 전에 반환되므로 데이터가 바뀌지 않습니다. 인증, 파일 업로드 저장소, 알림, 계정 동기화는 의도적으로 mock으로 남겨 두었습니다.</w:t>
+      </w:r>
+    </w:p>
+    <w:bookmarkEnd w:id="37"/>
+    <w:bookmarkStart w:id="38" w:name="X82218aca50032429e4fa24576e357c171c8760b"/>
+    <w:p>
+      <w:pPr>
+        <w:pStyle w:val="Heading3"/>
+      </w:pPr>
+      <w:r>
+        <w:t xml:space="preserve">8.4 함께 둔 자료</w:t>
+      </w:r>
+    </w:p>
+    <w:tbl>
+      <w:tblPr>
+        <w:tblStyle w:val="Table"/>
+        <w:tblW w:type="auto" w:w="0"/>
+        <w:tblLook w:firstRow="1" w:lastRow="0" w:firstColumn="0" w:lastColumn="0" w:noHBand="0" w:noVBand="0" w:val="0020"/>
+        <w:jc w:val="start"/>
+      </w:tblPr>
+      <w:tblGrid>
+        <w:gridCol w:w="2640"/>
+        <w:gridCol w:w="2640"/>
+        <w:gridCol w:w="2640"/>
+      </w:tblGrid>
+      <w:tr>
+        <w:trPr>
+          <w:tblHeader w:val="true"/>
+        </w:trPr>
+        <w:tc>
+          <w:tcPr/>
+          <w:p>
+            <w:pPr>
+              <w:pStyle w:val="Compact"/>
+              <w:jc w:val="left"/>
+            </w:pPr>
+            <w:r>
+              <w:t xml:space="preserve">자료</w:t>
+            </w:r>
+          </w:p>
+        </w:tc>
+        <w:tc>
+          <w:tcPr/>
+          <w:p>
+            <w:pPr>
+              <w:pStyle w:val="Compact"/>
+              <w:jc w:val="left"/>
+            </w:pPr>
+            <w:r>
+              <w:t xml:space="preserve">위치</w:t>
+            </w:r>
+          </w:p>
+        </w:tc>
+        <w:tc>
+          <w:tcPr/>
+          <w:p>
+            <w:pPr>
+              <w:pStyle w:val="Compact"/>
+              <w:jc w:val="left"/>
+            </w:pPr>
+            <w:r>
+              <w:t xml:space="preserve">대상</w:t>
+            </w:r>
+          </w:p>
+        </w:tc>
+      </w:tr>
+      <w:tr>
+        <w:tc>
+          <w:tcPr/>
+          <w:p>
+            <w:pPr>
+              <w:pStyle w:val="Compact"/>
+              <w:jc w:val="left"/>
+            </w:pPr>
+            <w:r>
+              <w:t xml:space="preserve">정적 HTML 데모</w:t>
+            </w:r>
+          </w:p>
+        </w:tc>
+        <w:tc>
+          <w:tcPr/>
+          <w:p>
+            <w:pPr>
+              <w:pStyle w:val="Compact"/>
+              <w:jc w:val="left"/>
+            </w:pPr>
+            <w:r>
+              <w:rPr>
+                <w:rStyle w:val="VerbatimChar"/>
+              </w:rPr>
+              <w:t xml:space="preserve">static-html/</w:t>
+            </w:r>
+          </w:p>
+        </w:tc>
+        <w:tc>
+          <w:tcPr/>
+          <w:p>
+            <w:pPr>
+              <w:pStyle w:val="Compact"/>
+              <w:jc w:val="left"/>
+            </w:pPr>
+            <w:r>
+              <w:t xml:space="preserve">기획자·팀원이 React 환경 없이</w:t>
+            </w:r>
+            <w:r>
+              <w:t xml:space="preserve"> </w:t>
+            </w:r>
+            <w:r>
+              <w:rPr>
+                <w:rStyle w:val="VerbatimChar"/>
+              </w:rPr>
+              <w:t xml:space="preserve">index.html</w:t>
+            </w:r>
+            <w:r>
+              <w:t xml:space="preserve">만 열어 흐름 확인</w:t>
+            </w:r>
+          </w:p>
+        </w:tc>
+      </w:tr>
+      <w:tr>
+        <w:tc>
+          <w:tcPr/>
+          <w:p>
+            <w:pPr>
+              <w:pStyle w:val="Compact"/>
+              <w:jc w:val="left"/>
+            </w:pPr>
+            <w:r>
+              <w:t xml:space="preserve">화면별 설계 기록</w:t>
+            </w:r>
+          </w:p>
+        </w:tc>
+        <w:tc>
+          <w:tcPr/>
+          <w:p>
+            <w:pPr>
+              <w:pStyle w:val="Compact"/>
+              <w:jc w:val="left"/>
+            </w:pPr>
+            <w:r>
+              <w:rPr>
+                <w:rStyle w:val="VerbatimChar"/>
+              </w:rPr>
+              <w:t xml:space="preserve">docs/design-log/</w:t>
+            </w:r>
+          </w:p>
+        </w:tc>
+        <w:tc>
+          <w:tcPr/>
+          <w:p>
+            <w:pPr>
+              <w:pStyle w:val="Compact"/>
+              <w:jc w:val="left"/>
+            </w:pPr>
+            <w:r>
+              <w:t xml:space="preserve">디자이너·기획자 관점의 구현 기록(문의 목록, 상세, 공지, 담당자 등)</w:t>
+            </w:r>
+          </w:p>
+        </w:tc>
+      </w:tr>
+      <w:tr>
+        <w:tc>
+          <w:tcPr/>
+          <w:p>
+            <w:pPr>
+              <w:pStyle w:val="Compact"/>
+              <w:jc w:val="left"/>
+            </w:pPr>
+            <w:r>
+              <w:t xml:space="preserve">백엔드 인계 문서</w:t>
+            </w:r>
+          </w:p>
+        </w:tc>
+        <w:tc>
+          <w:tcPr/>
+          <w:p>
+            <w:pPr>
+              <w:pStyle w:val="Compact"/>
+              <w:jc w:val="left"/>
+            </w:pPr>
+            <w:r>
+              <w:rPr>
+                <w:rStyle w:val="VerbatimChar"/>
+              </w:rPr>
+              <w:t xml:space="preserve">docs/backend-handoff.md</w:t>
+            </w:r>
+          </w:p>
+        </w:tc>
+        <w:tc>
+          <w:tcPr/>
+          <w:p>
+            <w:pPr>
+              <w:pStyle w:val="Compact"/>
+              <w:jc w:val="left"/>
+            </w:pPr>
+            <w:r>
+              <w:t xml:space="preserve">백엔드 개발자가 구현할 endpoint와 응답 계약</w:t>
+            </w:r>
+          </w:p>
+        </w:tc>
+      </w:tr>
+      <w:tr>
+        <w:tc>
+          <w:tcPr/>
+          <w:p>
+            <w:pPr>
+              <w:pStyle w:val="Compact"/>
+              <w:jc w:val="left"/>
+            </w:pPr>
+            <w:r>
+              <w:t xml:space="preserve">10분 발표 대본</w:t>
+            </w:r>
+          </w:p>
+        </w:tc>
+        <w:tc>
+          <w:tcPr/>
+          <w:p>
+            <w:pPr>
+              <w:pStyle w:val="Compact"/>
+              <w:jc w:val="left"/>
+            </w:pPr>
+            <w:r>
+              <w:rPr>
+                <w:rStyle w:val="VerbatimChar"/>
+              </w:rPr>
+              <w:t xml:space="preserve">docs/presentation/</w:t>
+            </w:r>
+          </w:p>
+        </w:tc>
+        <w:tc>
+          <w:tcPr/>
+          <w:p>
+            <w:pPr>
+              <w:pStyle w:val="Compact"/>
+              <w:jc w:val="left"/>
+            </w:pPr>
+            <w:r>
+              <w:t xml:space="preserve">팀 발표용</w:t>
+            </w:r>
+          </w:p>
+        </w:tc>
+      </w:tr>
+      <w:tr>
+        <w:tc>
+          <w:tcPr/>
+          <w:p>
+            <w:pPr>
+              <w:pStyle w:val="Compact"/>
+              <w:jc w:val="left"/>
+            </w:pPr>
+            <w:r>
+              <w:t xml:space="preserve">작업 인계 문서</w:t>
+            </w:r>
+          </w:p>
+        </w:tc>
+        <w:tc>
+          <w:tcPr/>
+          <w:p>
+            <w:pPr>
+              <w:pStyle w:val="Compact"/>
+              <w:jc w:val="left"/>
+            </w:pPr>
+            <w:r>
+              <w:rPr>
+                <w:rStyle w:val="VerbatimChar"/>
+              </w:rPr>
+              <w:t xml:space="preserve">CONTINUE_HERE.md</w:t>
+            </w:r>
+          </w:p>
+        </w:tc>
+        <w:tc>
+          <w:tcPr/>
+          <w:p>
+            <w:pPr>
+              <w:pStyle w:val="Compact"/>
+              <w:jc w:val="left"/>
+            </w:pPr>
+            <w:r>
+              <w:t xml:space="preserve">다른 PC의 AI가 작업을 이어받기 위한 문서</w:t>
+            </w:r>
+          </w:p>
+        </w:tc>
+      </w:tr>
+    </w:tbl>
+    <w:p>
+      <w:pPr>
+        <w:pStyle w:val="BodyText"/>
+      </w:pPr>
+      <w:r>
+        <w:rPr>
+          <w:rStyle w:val="VerbatimChar"/>
+        </w:rPr>
+        <w:t xml:space="preserve">CONTINUE_HERE.md</w:t>
+      </w:r>
+      <w:r>
+        <w:t xml:space="preserve">에는 기록을 team-library에 옮길 마크다운 형식으로 관리한다고 적혀 있습니다.</w:t>
+      </w:r>
+    </w:p>
+    <w:bookmarkEnd w:id="38"/>
+    <w:bookmarkStart w:id="39" w:name="X12eca6be0bf4278b1d7b37ec6dac84548d0cd2d"/>
+    <w:p>
+      <w:pPr>
+        <w:pStyle w:val="Heading3"/>
+      </w:pPr>
+      <w:r>
+        <w:t xml:space="preserve">8.5 세 단계 비교</w:t>
+      </w:r>
+    </w:p>
+    <w:tbl>
+      <w:tblPr>
+        <w:tblStyle w:val="Table"/>
+        <w:tblW w:type="auto" w:w="0"/>
+        <w:tblLook w:firstRow="1" w:lastRow="0" w:firstColumn="0" w:lastColumn="0" w:noHBand="0" w:noVBand="0" w:val="0020"/>
+        <w:jc w:val="start"/>
+      </w:tblPr>
+      <w:tblGrid>
+        <w:gridCol w:w="1980"/>
+        <w:gridCol w:w="1980"/>
+        <w:gridCol w:w="1980"/>
+        <w:gridCol w:w="1980"/>
+      </w:tblGrid>
+      <w:tr>
+        <w:trPr>
+          <w:tblHeader w:val="true"/>
+        </w:trPr>
+        <w:tc>
+          <w:tcPr/>
+          <w:p>
+            <w:pPr>
+              <w:pStyle w:val="Compact"/>
+              <w:jc w:val="left"/>
+            </w:pPr>
+            <w:r>
+              <w:t xml:space="preserve">항목</w:t>
+            </w:r>
+          </w:p>
+        </w:tc>
+        <w:tc>
+          <w:tcPr/>
+          <w:p>
+            <w:pPr>
+              <w:pStyle w:val="Compact"/>
+              <w:jc w:val="left"/>
+            </w:pPr>
+            <w:r>
+              <w:rPr>
+                <w:rStyle w:val="VerbatimChar"/>
+              </w:rPr>
+              <w:t xml:space="preserve">happicare</w:t>
+            </w:r>
+          </w:p>
+        </w:tc>
+        <w:tc>
+          <w:tcPr/>
+          <w:p>
+            <w:pPr>
+              <w:pStyle w:val="Compact"/>
+              <w:jc w:val="left"/>
+            </w:pPr>
+            <w:r>
+              <w:rPr>
+                <w:rStyle w:val="VerbatimChar"/>
+              </w:rPr>
+              <w:t xml:space="preserve">happicare_admin_version2</w:t>
+            </w:r>
+          </w:p>
+        </w:tc>
+        <w:tc>
+          <w:tcPr/>
+          <w:p>
+            <w:pPr>
+              <w:pStyle w:val="Compact"/>
+              <w:jc w:val="left"/>
+            </w:pPr>
+            <w:r>
+              <w:rPr>
+                <w:rStyle w:val="VerbatimChar"/>
+              </w:rPr>
+              <w:t xml:space="preserve">happicare_front2</w:t>
+            </w:r>
+          </w:p>
+        </w:tc>
+      </w:tr>
+      <w:tr>
+        <w:tc>
+          <w:tcPr/>
+          <w:p>
+            <w:pPr>
+              <w:pStyle w:val="Compact"/>
+              <w:jc w:val="left"/>
+            </w:pPr>
+            <w:r>
+              <w:t xml:space="preserve">대상 화면</w:t>
+            </w:r>
+          </w:p>
+        </w:tc>
+        <w:tc>
+          <w:tcPr/>
+          <w:p>
+            <w:pPr>
+              <w:pStyle w:val="Compact"/>
+              <w:jc w:val="left"/>
+            </w:pPr>
+            <w:r>
+              <w:t xml:space="preserve">고객</w:t>
+            </w:r>
+          </w:p>
+        </w:tc>
+        <w:tc>
+          <w:tcPr/>
+          <w:p>
+            <w:pPr>
+              <w:pStyle w:val="Compact"/>
+              <w:jc w:val="left"/>
+            </w:pPr>
+            <w:r>
+              <w:t xml:space="preserve">관리자</w:t>
+            </w:r>
+          </w:p>
+        </w:tc>
+        <w:tc>
+          <w:tcPr/>
+          <w:p>
+            <w:pPr>
+              <w:pStyle w:val="Compact"/>
+              <w:jc w:val="left"/>
+            </w:pPr>
+            <w:r>
+              <w:t xml:space="preserve">병원 + 관리자</w:t>
+            </w:r>
+          </w:p>
+        </w:tc>
+      </w:tr>
+      <w:tr>
+        <w:tc>
+          <w:tcPr/>
+          <w:p>
+            <w:pPr>
+              <w:pStyle w:val="Compact"/>
+              <w:jc w:val="left"/>
+            </w:pPr>
+            <w:r>
+              <w:t xml:space="preserve">데이터</w:t>
+            </w:r>
+          </w:p>
+        </w:tc>
+        <w:tc>
+          <w:tcPr/>
+          <w:p>
+            <w:pPr>
+              <w:pStyle w:val="Compact"/>
+              <w:jc w:val="left"/>
+            </w:pPr>
+            <w:r>
+              <w:rPr>
+                <w:rStyle w:val="VerbatimChar"/>
+              </w:rPr>
+              <w:t xml:space="preserve">sessionStorage</w:t>
+            </w:r>
+          </w:p>
+        </w:tc>
+        <w:tc>
+          <w:tcPr/>
+          <w:p>
+            <w:pPr>
+              <w:pStyle w:val="Compact"/>
+              <w:jc w:val="left"/>
+            </w:pPr>
+            <w:r>
+              <w:t xml:space="preserve">MSW +</w:t>
+            </w:r>
+            <w:r>
+              <w:t xml:space="preserve"> </w:t>
+            </w:r>
+            <w:r>
+              <w:rPr>
+                <w:rStyle w:val="VerbatimChar"/>
+              </w:rPr>
+              <w:t xml:space="preserve">localStorage</w:t>
+            </w:r>
+          </w:p>
+        </w:tc>
+        <w:tc>
+          <w:tcPr/>
+          <w:p>
+            <w:pPr>
+              <w:pStyle w:val="Compact"/>
+              <w:jc w:val="left"/>
+            </w:pPr>
+            <w:r>
+              <w:t xml:space="preserve">MariaDB + Prisma</w:t>
+            </w:r>
+          </w:p>
+        </w:tc>
+      </w:tr>
+      <w:tr>
+        <w:tc>
+          <w:tcPr/>
+          <w:p>
+            <w:pPr>
+              <w:pStyle w:val="Compact"/>
+              <w:jc w:val="left"/>
+            </w:pPr>
+            <w:r>
+              <w:t xml:space="preserve">백엔드</w:t>
+            </w:r>
+          </w:p>
+        </w:tc>
+        <w:tc>
+          <w:tcPr/>
+          <w:p>
+            <w:pPr>
+              <w:pStyle w:val="Compact"/>
+              <w:jc w:val="left"/>
+            </w:pPr>
+            <w:r>
+              <w:t xml:space="preserve">없음</w:t>
+            </w:r>
+          </w:p>
+        </w:tc>
+        <w:tc>
+          <w:tcPr/>
+          <w:p>
+            <w:pPr>
+              <w:pStyle w:val="Compact"/>
+              <w:jc w:val="left"/>
+            </w:pPr>
+            <w:r>
+              <w:t xml:space="preserve">없음(HTTP 계약만 정의)</w:t>
+            </w:r>
+          </w:p>
+        </w:tc>
+        <w:tc>
+          <w:tcPr/>
+          <w:p>
+            <w:pPr>
+              <w:pStyle w:val="Compact"/>
+              <w:jc w:val="left"/>
+            </w:pPr>
+            <w:r>
+              <w:t xml:space="preserve">NestJS</w:t>
+            </w:r>
+          </w:p>
+        </w:tc>
+      </w:tr>
+      <w:tr>
+        <w:tc>
+          <w:tcPr/>
+          <w:p>
+            <w:pPr>
+              <w:pStyle w:val="Compact"/>
+              <w:jc w:val="left"/>
+            </w:pPr>
+            <w:r>
+              <w:t xml:space="preserve">서버 전환 방식</w:t>
+            </w:r>
+          </w:p>
+        </w:tc>
+        <w:tc>
+          <w:tcPr/>
+          <w:p>
+            <w:pPr>
+              <w:pStyle w:val="Compact"/>
+              <w:jc w:val="left"/>
+            </w:pPr>
+            <w:r>
+              <w:t xml:space="preserve">데이터 소스 교체</w:t>
+            </w:r>
+          </w:p>
+        </w:tc>
+        <w:tc>
+          <w:tcPr/>
+          <w:p>
+            <w:pPr>
+              <w:pStyle w:val="Compact"/>
+              <w:jc w:val="left"/>
+            </w:pPr>
+            <w:r>
+              <w:t xml:space="preserve">환경변수 하나로 전환</w:t>
+            </w:r>
+          </w:p>
+        </w:tc>
+        <w:tc>
+          <w:tcPr/>
+          <w:p>
+            <w:pPr>
+              <w:pStyle w:val="Compact"/>
+              <w:jc w:val="left"/>
+            </w:pPr>
+            <w:r>
+              <w:t xml:space="preserve">해당 없음(이미 서버)</w:t>
+            </w:r>
+          </w:p>
+        </w:tc>
+      </w:tr>
+      <w:tr>
+        <w:tc>
+          <w:tcPr/>
+          <w:p>
+            <w:pPr>
+              <w:pStyle w:val="Compact"/>
+              <w:jc w:val="left"/>
+            </w:pPr>
+            <w:r>
+              <w:t xml:space="preserve">기획자용 산출물</w:t>
+            </w:r>
+          </w:p>
+        </w:tc>
+        <w:tc>
+          <w:tcPr/>
+          <w:p>
+            <w:pPr>
+              <w:pStyle w:val="Compact"/>
+              <w:jc w:val="left"/>
+            </w:pPr>
+            <w:r>
+              <w:t xml:space="preserve">발표 대본, 팀 보고서</w:t>
+            </w:r>
+          </w:p>
+        </w:tc>
+        <w:tc>
+          <w:tcPr/>
+          <w:p>
+            <w:pPr>
+              <w:pStyle w:val="Compact"/>
+              <w:jc w:val="left"/>
+            </w:pPr>
+            <w:r>
+              <w:t xml:space="preserve">정적 HTML 데모, 설계 기록</w:t>
+            </w:r>
+          </w:p>
+        </w:tc>
+        <w:tc>
+          <w:tcPr/>
+          <w:p>
+            <w:pPr>
+              <w:pStyle w:val="Compact"/>
+              <w:jc w:val="left"/>
+            </w:pPr>
+            <w:r>
+              <w:t xml:space="preserve">Concept·Design·ToDo, 시안</w:t>
+            </w:r>
+          </w:p>
+        </w:tc>
+      </w:tr>
+      <w:tr>
+        <w:tc>
+          <w:tcPr/>
+          <w:p>
+            <w:pPr>
+              <w:pStyle w:val="Compact"/>
+              <w:jc w:val="left"/>
+            </w:pPr>
+            <w:r>
+              <w:t xml:space="preserve">작업 기록</w:t>
+            </w:r>
+          </w:p>
+        </w:tc>
+        <w:tc>
+          <w:tcPr/>
+          <w:p>
+            <w:pPr>
+              <w:pStyle w:val="Compact"/>
+              <w:jc w:val="left"/>
+            </w:pPr>
+            <w:r>
+              <w:t xml:space="preserve">학습 가이드</w:t>
+            </w:r>
+          </w:p>
+        </w:tc>
+        <w:tc>
+          <w:tcPr/>
+          <w:p>
+            <w:pPr>
+              <w:pStyle w:val="Compact"/>
+              <w:jc w:val="left"/>
+            </w:pPr>
+            <w:r>
+              <w:t xml:space="preserve">design-log + 인계 문서</w:t>
+            </w:r>
+          </w:p>
+        </w:tc>
+        <w:tc>
+          <w:tcPr/>
+          <w:p>
+            <w:pPr>
+              <w:pStyle w:val="Compact"/>
+              <w:jc w:val="left"/>
+            </w:pPr>
+            <w:r>
+              <w:t xml:space="preserve">phase별 설계서·계획서</w:t>
+            </w:r>
+          </w:p>
+        </w:tc>
+      </w:tr>
+      <w:tr>
+        <w:tc>
+          <w:tcPr/>
+          <w:p>
+            <w:pPr>
+              <w:pStyle w:val="Compact"/>
+              <w:jc w:val="left"/>
+            </w:pPr>
+            <w:r>
+              <w:t xml:space="preserve">기간</w:t>
+            </w:r>
+          </w:p>
+        </w:tc>
+        <w:tc>
+          <w:tcPr/>
+          <w:p>
+            <w:pPr>
+              <w:pStyle w:val="Compact"/>
+              <w:jc w:val="left"/>
+            </w:pPr>
+            <w:r>
+              <w:t xml:space="preserve">2026-08-25~10-13</w:t>
+            </w:r>
+          </w:p>
+        </w:tc>
+        <w:tc>
+          <w:tcPr/>
+          <w:p>
+            <w:pPr>
+              <w:pStyle w:val="Compact"/>
+              <w:jc w:val="left"/>
+            </w:pPr>
+            <w:r>
+              <w:t xml:space="preserve">2026-09-06~09-20</w:t>
+            </w:r>
+          </w:p>
+        </w:tc>
+        <w:tc>
+          <w:tcPr/>
+          <w:p>
+            <w:pPr>
+              <w:pStyle w:val="Compact"/>
+              <w:jc w:val="left"/>
+            </w:pPr>
+            <w:r>
+              <w:t xml:space="preserve">2026-09-30~10-11</w:t>
+            </w:r>
+          </w:p>
+        </w:tc>
+      </w:tr>
+    </w:tbl>
+    <w:bookmarkEnd w:id="39"/>
+    <w:bookmarkStart w:id="40" w:name="X83b70688dfb7f7f01f5e3f0b80b958703a0d704"/>
+    <w:p>
+      <w:pPr>
+        <w:pStyle w:val="Heading3"/>
+      </w:pPr>
+      <w:r>
+        <w:t xml:space="preserve">8.6 직군별 추가 포인트</w:t>
+      </w:r>
+    </w:p>
+    <w:p>
+      <w:pPr>
+        <w:numPr>
+          <w:ilvl w:val="0"/>
+          <w:numId w:val="1016"/>
+        </w:numPr>
+        <w:pStyle w:val="Compact"/>
+      </w:pPr>
+      <w:r>
+        <w:rPr>
+          <w:bCs/>
+          <w:b/>
+        </w:rPr>
+        <w:t xml:space="preserve">기획자:</w:t>
+      </w:r>
+      <w:r>
+        <w:t xml:space="preserve"> </w:t>
+      </w:r>
+      <w:r>
+        <w:t xml:space="preserve">정적 HTML 데모(</w:t>
+      </w:r>
+      <w:r>
+        <w:rPr>
+          <w:rStyle w:val="VerbatimChar"/>
+        </w:rPr>
+        <w:t xml:space="preserve">static-html/</w:t>
+      </w:r>
+      <w:r>
+        <w:t xml:space="preserve">)는 설치 없이 브라우저에서 열 수 있어 기획 검토나 내부 시연에 바로 쓸 수 있습니다.</w:t>
+      </w:r>
+    </w:p>
+    <w:p>
+      <w:pPr>
+        <w:numPr>
+          <w:ilvl w:val="0"/>
+          <w:numId w:val="1016"/>
+        </w:numPr>
+        <w:pStyle w:val="Compact"/>
+      </w:pPr>
+      <w:r>
+        <w:rPr>
+          <w:bCs/>
+          <w:b/>
+        </w:rPr>
+        <w:t xml:space="preserve">웹퍼블리셔:</w:t>
+      </w:r>
+      <w:r>
+        <w:t xml:space="preserve"> </w:t>
+      </w:r>
+      <w:r>
+        <w:rPr>
+          <w:rStyle w:val="VerbatimChar"/>
+        </w:rPr>
+        <w:t xml:space="preserve">docs/design-log/</w:t>
+      </w:r>
+      <w:r>
+        <w:t xml:space="preserve">에 화면마다 외관 기록이 있어 디자인 의도를 추적하기 좋습니다.</w:t>
+      </w:r>
+      <w:r>
+        <w:t xml:space="preserve"> </w:t>
+      </w:r>
+      <w:r>
+        <w:rPr>
+          <w:rStyle w:val="VerbatimChar"/>
+        </w:rPr>
+        <w:t xml:space="preserve">?mockDelay</w:t>
+      </w:r>
+      <w:r>
+        <w:t xml:space="preserve">와</w:t>
+      </w:r>
+      <w:r>
+        <w:t xml:space="preserve"> </w:t>
+      </w:r>
+      <w:r>
+        <w:rPr>
+          <w:rStyle w:val="VerbatimChar"/>
+        </w:rPr>
+        <w:t xml:space="preserve">?mockStatus</w:t>
+      </w:r>
+      <w:r>
+        <w:t xml:space="preserve">로 로딩·오류 상태 화면을 직접 확인할 수 있습니다.</w:t>
+      </w:r>
+    </w:p>
+    <w:p>
+      <w:pPr>
+        <w:numPr>
+          <w:ilvl w:val="0"/>
+          <w:numId w:val="1016"/>
+        </w:numPr>
+        <w:pStyle w:val="Compact"/>
+      </w:pPr>
+      <w:r>
+        <w:rPr>
+          <w:bCs/>
+          <w:b/>
+        </w:rPr>
+        <w:t xml:space="preserve">개발자:</w:t>
+      </w:r>
+      <w:r>
+        <w:t xml:space="preserve"> </w:t>
+      </w:r>
+      <w:r>
+        <w:t xml:space="preserve">MSW 방식은 프론트와 백엔드를 병렬로 개발하게 해 줍니다.</w:t>
+      </w:r>
+      <w:r>
+        <w:t xml:space="preserve"> </w:t>
+      </w:r>
+      <w:r>
+        <w:rPr>
+          <w:rStyle w:val="VerbatimChar"/>
+        </w:rPr>
+        <w:t xml:space="preserve">docs/backend-handoff.md</w:t>
+      </w:r>
+      <w:r>
+        <w:t xml:space="preserve">의 계약이 곧 백엔드 구현 기준입니다. 같은 화면이</w:t>
+      </w:r>
+      <w:r>
+        <w:t xml:space="preserve"> </w:t>
+      </w:r>
+      <w:r>
+        <w:rPr>
+          <w:rStyle w:val="VerbatimChar"/>
+        </w:rPr>
+        <w:t xml:space="preserve">happicare_front2</w:t>
+      </w:r>
+      <w:r>
+        <w:t xml:space="preserve">에도 있으므로 중복 구현 여부를 정리해야 합니다.</w:t>
+      </w:r>
+    </w:p>
+    <w:bookmarkEnd w:id="40"/>
+    <w:bookmarkStart w:id="41" w:name="X76b77b243b6789953e98afa4d2ded787ee45116"/>
+    <w:p>
+      <w:pPr>
+        <w:pStyle w:val="Heading3"/>
+      </w:pPr>
+      <w:r>
+        <w:t xml:space="preserve">8.7 추가로 팀에 요청할 결정</w:t>
+      </w:r>
+    </w:p>
+    <w:p>
+      <w:pPr>
+        <w:numPr>
+          <w:ilvl w:val="0"/>
+          <w:numId w:val="1017"/>
+        </w:numPr>
+        <w:pStyle w:val="Compact"/>
+      </w:pPr>
+      <w:r>
+        <w:rPr>
+          <w:rStyle w:val="VerbatimChar"/>
+        </w:rPr>
+        <w:t xml:space="preserve">happicare_admin_version2</w:t>
+      </w:r>
+      <w:r>
+        <w:t xml:space="preserve">와</w:t>
+      </w:r>
+      <w:r>
+        <w:t xml:space="preserve"> </w:t>
+      </w:r>
+      <w:r>
+        <w:rPr>
+          <w:rStyle w:val="VerbatimChar"/>
+        </w:rPr>
+        <w:t xml:space="preserve">happicare_front2</w:t>
+      </w:r>
+      <w:r>
+        <w:t xml:space="preserve">의 관리자 화면 중 어느 쪽을 기준으로 삼을지</w:t>
+      </w:r>
+    </w:p>
+    <w:p>
+      <w:pPr>
+        <w:numPr>
+          <w:ilvl w:val="0"/>
+          <w:numId w:val="1017"/>
+        </w:numPr>
+        <w:pStyle w:val="Compact"/>
+      </w:pPr>
+      <w:r>
+        <w:t xml:space="preserve">빈 저장소</w:t>
+      </w:r>
+      <w:r>
+        <w:t xml:space="preserve"> </w:t>
+      </w:r>
+      <w:r>
+        <w:rPr>
+          <w:rStyle w:val="VerbatimChar"/>
+        </w:rPr>
+        <w:t xml:space="preserve">happicare_admin</w:t>
+      </w:r>
+      <w:r>
+        <w:t xml:space="preserve">을 보관할지 삭제할지</w:t>
+      </w:r>
+    </w:p>
+    <w:bookmarkEnd w:id="41"/>
+    <w:bookmarkEnd w:id="42"/>
+    <w:bookmarkStart w:id="43" w:name="X30777068d3e686a41e405b36c495cc5cd14b409"/>
+    <w:p>
+      <w:pPr>
+        <w:pStyle w:val="Heading2"/>
+      </w:pPr>
+      <w:r>
+        <w:t xml:space="preserve">9. 참고 위치</w:t>
+      </w:r>
+    </w:p>
+    <w:tbl>
+      <w:tblPr>
+        <w:tblStyle w:val="Table"/>
+        <w:tblW w:type="auto" w:w="0"/>
+        <w:tblLook w:firstRow="1" w:lastRow="0" w:firstColumn="0" w:lastColumn="0" w:noHBand="0" w:noVBand="0" w:val="0020"/>
+        <w:jc w:val="start"/>
+      </w:tblPr>
+      <w:tblGrid>
+        <w:gridCol w:w="3960"/>
+        <w:gridCol w:w="3960"/>
+      </w:tblGrid>
+      <w:tr>
+        <w:trPr>
+          <w:tblHeader w:val="true"/>
+        </w:trPr>
+        <w:tc>
+          <w:tcPr/>
+          <w:p>
+            <w:pPr>
+              <w:pStyle w:val="Compact"/>
+              <w:jc w:val="left"/>
+            </w:pPr>
+            <w:r>
               <w:t xml:space="preserve">자료</w:t>
             </w:r>
           </w:p>
@@ -3818,9 +5501,108 @@
           </w:p>
         </w:tc>
       </w:tr>
+      <w:tr>
+        <w:tc>
+          <w:tcPr/>
+          <w:p>
+            <w:pPr>
+              <w:pStyle w:val="Compact"/>
+              <w:jc w:val="left"/>
+            </w:pPr>
+            <w:r>
+              <w:t xml:space="preserve">관리자 프로토타입 개요</w:t>
+            </w:r>
+          </w:p>
+        </w:tc>
+        <w:tc>
+          <w:tcPr/>
+          <w:p>
+            <w:pPr>
+              <w:pStyle w:val="Compact"/>
+              <w:jc w:val="left"/>
+            </w:pPr>
+            <w:r>
+              <w:rPr>
+                <w:rStyle w:val="VerbatimChar"/>
+              </w:rPr>
+              <w:t xml:space="preserve">happicare_admin_version2/README.md</w:t>
+            </w:r>
+            <w:r>
+              <w:t xml:space="preserve">,</w:t>
+            </w:r>
+            <w:r>
+              <w:t xml:space="preserve"> </w:t>
+            </w:r>
+            <w:r>
+              <w:rPr>
+                <w:rStyle w:val="VerbatimChar"/>
+              </w:rPr>
+              <w:t xml:space="preserve">CONTINUE_HERE.md</w:t>
+            </w:r>
+          </w:p>
+        </w:tc>
+      </w:tr>
+      <w:tr>
+        <w:tc>
+          <w:tcPr/>
+          <w:p>
+            <w:pPr>
+              <w:pStyle w:val="Compact"/>
+              <w:jc w:val="left"/>
+            </w:pPr>
+            <w:r>
+              <w:t xml:space="preserve">백엔드 인계</w:t>
+            </w:r>
+          </w:p>
+        </w:tc>
+        <w:tc>
+          <w:tcPr/>
+          <w:p>
+            <w:pPr>
+              <w:pStyle w:val="Compact"/>
+              <w:jc w:val="left"/>
+            </w:pPr>
+            <w:r>
+              <w:rPr>
+                <w:rStyle w:val="VerbatimChar"/>
+              </w:rPr>
+              <w:t xml:space="preserve">happicare_admin_version2/docs/backend-handoff.md</w:t>
+            </w:r>
+          </w:p>
+        </w:tc>
+      </w:tr>
+      <w:tr>
+        <w:tc>
+          <w:tcPr/>
+          <w:p>
+            <w:pPr>
+              <w:pStyle w:val="Compact"/>
+              <w:jc w:val="left"/>
+            </w:pPr>
+            <w:r>
+              <w:t xml:space="preserve">정적 HTML 데모</w:t>
+            </w:r>
+          </w:p>
+        </w:tc>
+        <w:tc>
+          <w:tcPr/>
+          <w:p>
+            <w:pPr>
+              <w:pStyle w:val="Compact"/>
+              <w:jc w:val="left"/>
+            </w:pPr>
+            <w:r>
+              <w:rPr>
+                <w:rStyle w:val="VerbatimChar"/>
+              </w:rPr>
+              <w:t xml:space="preserve">happicare_admin_version2/static-html/</w:t>
+            </w:r>
+          </w:p>
+        </w:tc>
+      </w:tr>
     </w:tbl>
-    <w:bookmarkEnd w:id="35"/>
-    <w:bookmarkEnd w:id="36"/>
+    <w:bookmarkEnd w:id="43"/>
+    <w:bookmarkEnd w:id="44"/>
     <w:sectPr/>
   </w:body>
 </w:document>
@@ -4182,6 +5964,18 @@
     </w:lvlOverride>
   </w:num>
   <w:num w:numId="1013">
+    <w:abstractNumId w:val="991"/>
+  </w:num>
+  <w:num w:numId="1014">
+    <w:abstractNumId w:val="991"/>
+  </w:num>
+  <w:num w:numId="1015">
+    <w:abstractNumId w:val="991"/>
+  </w:num>
+  <w:num w:numId="1016">
+    <w:abstractNumId w:val="991"/>
+  </w:num>
+  <w:num w:numId="1017">
     <w:abstractNumId w:val="991"/>
   </w:num>
 </w:numbering>

</xml_diff>

<commit_message>
Fix report title encoding
Co-Authored-By: Claude Sonnet 5.5 <noreply@anthropic.com>
Claude-Session: https://claude.ai/code/session_018MxhhtNcXMywPHAmzeQnb1
</commit_message>
<xml_diff>
--- a/happicare-presentation/HappiCare_방식비교_보고서.docx
+++ b/happicare-presentation/HappiCare_방식비교_보고서.docx
@@ -7,16 +7,19 @@
         <w:pStyle w:val="Title"/>
       </w:pPr>
       <w:r>
-        <w:t xml:space="preserve">HappiCare ��������� ������</w:t>
-      </w:r>
-    </w:p>
-    <w:bookmarkStart w:id="44" w:name="happicare-두-가지-바이브코딩-방식-비교"/>
-    <w:p>
-      <w:pPr>
-        <w:pStyle w:val="Heading1"/>
-      </w:pPr>
-      <w:r>
-        <w:t xml:space="preserve">HappiCare 두 가지 바이브코딩 방식 비교</w:t>
+        <w:t xml:space="preserve">HappiCare</w:t>
+      </w:r>
+      <w:r>
+        <w:t xml:space="preserve"> </w:t>
+      </w:r>
+      <w:r>
+        <w:t xml:space="preserve">저장소</w:t>
+      </w:r>
+      <w:r>
+        <w:t xml:space="preserve"> </w:t>
+      </w:r>
+      <w:r>
+        <w:t xml:space="preserve">비교</w:t>
       </w:r>
     </w:p>
     <w:p>
@@ -5602,7 +5605,6 @@
       </w:tr>
     </w:tbl>
     <w:bookmarkEnd w:id="43"/>
-    <w:bookmarkEnd w:id="44"/>
     <w:sectPr/>
   </w:body>
 </w:document>

</xml_diff>